<commit_message>
fix: front end arrange block
</commit_message>
<xml_diff>
--- a/exports/English_Standard_Exam_THCS.docx
+++ b/exports/English_Standard_Exam_THCS.docx
@@ -2,146 +2,6 @@
 <file path=word/document.xml><?xml version="1.0" encoding="utf-8"?>
 <w:document xmlns:wpc="http://schemas.microsoft.com/office/word/2010/wordprocessingCanvas" xmlns:mo="http://schemas.microsoft.com/office/mac/office/2008/main" xmlns:mc="http://schemas.openxmlformats.org/markup-compatibility/2006" xmlns:mv="urn:schemas-microsoft-com:mac:vml" xmlns:o="urn:schemas-microsoft-com:office:office" xmlns:r="http://schemas.openxmlformats.org/officeDocument/2006/relationships" xmlns:m="http://schemas.openxmlformats.org/officeDocument/2006/math" xmlns:v="urn:schemas-microsoft-com:vml" xmlns:wp14="http://schemas.microsoft.com/office/word/2010/wordprocessingDrawing" xmlns:wp="http://schemas.openxmlformats.org/drawingml/2006/wordprocessingDrawing" xmlns:w10="urn:schemas-microsoft-com:office:word" xmlns:w="http://schemas.openxmlformats.org/wordprocessingml/2006/main" xmlns:w14="http://schemas.microsoft.com/office/word/2010/wordml" xmlns:wpg="http://schemas.microsoft.com/office/word/2010/wordprocessingGroup" xmlns:wpi="http://schemas.microsoft.com/office/word/2010/wordprocessingInk" xmlns:wne="http://schemas.microsoft.com/office/word/2006/wordml" xmlns:wps="http://schemas.microsoft.com/office/word/2010/wordprocessingShape" mc:Ignorable="w14 wp14">
   <w:body>
-    <w:p>
-      <w:r>
-        <w:rPr>
-          <w:b/>
-        </w:rPr>
-        <w:t>Sentence combination: Choose A, B, C or D that has the CLOSEST meaning to the given pair of sentences in each question.</w:t>
-      </w:r>
-    </w:p>
-    <w:p>
-      <w:r>
-        <w:rPr>
-          <w:b/>
-        </w:rPr>
-        <w:t xml:space="preserve">Question 1: </w:t>
-      </w:r>
-      <w:r>
-        <w:t>The manager will check the report carefully. Then, she will send it to the client.</w:t>
-      </w:r>
-    </w:p>
-    <w:p>
-      <w:r>
-        <w:t>A. The manager will send the report to the client before she checks it carefully.</w:t>
-      </w:r>
-    </w:p>
-    <w:p>
-      <w:r>
-        <w:t>B. After the manager has checked the report carefully, she will send it to the client.</w:t>
-      </w:r>
-    </w:p>
-    <w:p>
-      <w:r>
-        <w:t>C. The manager will send the report to the client while she checks it carefully.</w:t>
-      </w:r>
-    </w:p>
-    <w:p>
-      <w:r>
-        <w:t>D. Before the manager sends the report to the client, she had checked it carefully.</w:t>
-      </w:r>
-    </w:p>
-    <w:p>
-      <w:r>
-        <w:rPr>
-          <w:b/>
-        </w:rPr>
-        <w:t>Sentence rewriting: Choose A, B, C or D that has the CLOSEST meaning to the given sentence in each question.</w:t>
-      </w:r>
-    </w:p>
-    <w:p>
-      <w:r>
-        <w:rPr>
-          <w:b/>
-        </w:rPr>
-        <w:t xml:space="preserve">Question 2: </w:t>
-      </w:r>
-      <w:r>
-        <w:t>If you recycle more plastic, you will reduce the amount of waste in your neighborhood.</w:t>
-      </w:r>
-    </w:p>
-    <w:p>
-      <w:r>
-        <w:t>A. Unless you recycle more plastic, you will reduce the amount of waste in your neighborhood.</w:t>
-      </w:r>
-    </w:p>
-    <w:p>
-      <w:r>
-        <w:t>B. If you recycled more plastic, you would reduce the amount of waste in your neighborhood.</w:t>
-      </w:r>
-    </w:p>
-    <w:p>
-      <w:r>
-        <w:t>C. You will reduce the amount of waste in your neighborhood if you recycle more plastic.</w:t>
-      </w:r>
-    </w:p>
-    <w:p>
-      <w:r>
-        <w:t>D. When you reduce the amount of waste in your neighborhood, you will recycle more plastic.</w:t>
-      </w:r>
-    </w:p>
-    <w:p>
-      <w:r>
-        <w:rPr>
-          <w:b/>
-        </w:rPr>
-        <w:t xml:space="preserve">Question 3: </w:t>
-      </w:r>
-      <w:r>
-        <w:t>No other student in my class is as good at public speaking as Lan.</w:t>
-      </w:r>
-    </w:p>
-    <w:p>
-      <w:r>
-        <w:t>A. Lan is better at public speaking than any other student in my class.</w:t>
-      </w:r>
-    </w:p>
-    <w:p>
-      <w:r>
-        <w:t>B. Lan is as good at public speaking as the other students in my class.</w:t>
-      </w:r>
-    </w:p>
-    <w:p>
-      <w:r>
-        <w:t>C. Lan is the goodest student at public speaking in my class.</w:t>
-      </w:r>
-    </w:p>
-    <w:p>
-      <w:r>
-        <w:t>D. Lan speaks in public better than all students in my class.</w:t>
-      </w:r>
-    </w:p>
-    <w:p>
-      <w:r>
-        <w:rPr>
-          <w:b/>
-        </w:rPr>
-        <w:t xml:space="preserve">Question 4: </w:t>
-      </w:r>
-      <w:r>
-        <w:t>My brother likes playing basketball after school.</w:t>
-      </w:r>
-    </w:p>
-    <w:p>
-      <w:r>
-        <w:t>A. My brother enjoys to play basketball after school.</w:t>
-      </w:r>
-    </w:p>
-    <w:p>
-      <w:r>
-        <w:t>B. My brother enjoys playing basketball after school.</w:t>
-      </w:r>
-    </w:p>
-    <w:p>
-      <w:r>
-        <w:t>C. My brother wants playing basketball after school.</w:t>
-      </w:r>
-    </w:p>
-    <w:p>
-      <w:r>
-        <w:t>D. My brother enjoys play basketball after school.</w:t>
-      </w:r>
-    </w:p>
     <w:p>
       <w:r>
         <w:rPr>
@@ -156,7 +16,7 @@
         <w:rPr>
           <w:b/>
         </w:rPr>
-        <w:t xml:space="preserve">Question 5: </w:t>
+        <w:t xml:space="preserve">Question 1: </w:t>
       </w:r>
       <w:r>
         <w:rPr>
@@ -165,16 +25,16 @@
         <w:t xml:space="preserve">A. </w:t>
       </w:r>
       <w:r>
-        <w:t>shoppi</w:t>
+        <w:t>vill</w:t>
       </w:r>
       <w:r>
         <w:rPr>
           <w:u w:val="single"/>
         </w:rPr>
-        <w:t>n</w:t>
+        <w:t>a</w:t>
       </w:r>
       <w:r>
-        <w:t>g</w:t>
+        <w:t>ge</w:t>
       </w:r>
       <w:r>
         <w:tab/>
@@ -186,13 +46,16 @@
         <w:t xml:space="preserve">B. </w:t>
       </w:r>
       <w:r>
-        <w:t>bargai</w:t>
+        <w:t>m</w:t>
       </w:r>
       <w:r>
         <w:rPr>
           <w:u w:val="single"/>
         </w:rPr>
-        <w:t>n</w:t>
+        <w:t>e</w:t>
+      </w:r>
+      <w:r>
+        <w:t>mber</w:t>
       </w:r>
       <w:r>
         <w:tab/>
@@ -204,13 +67,16 @@
         <w:t xml:space="preserve">C. </w:t>
       </w:r>
       <w:r>
-        <w:t>chai</w:t>
+        <w:t>g</w:t>
       </w:r>
       <w:r>
         <w:rPr>
           <w:u w:val="single"/>
         </w:rPr>
-        <w:t>n</w:t>
+        <w:t>a</w:t>
+      </w:r>
+      <w:r>
+        <w:t>ther</w:t>
       </w:r>
       <w:r>
         <w:tab/>
@@ -222,16 +88,16 @@
         <w:t xml:space="preserve">D. </w:t>
       </w:r>
       <w:r>
-        <w:t>payi</w:t>
+        <w:t>h</w:t>
       </w:r>
       <w:r>
         <w:rPr>
           <w:u w:val="single"/>
         </w:rPr>
-        <w:t>n</w:t>
+        <w:t>a</w:t>
       </w:r>
       <w:r>
-        <w:t>g</w:t>
+        <w:t>mlet</w:t>
       </w:r>
     </w:p>
     <w:p>
@@ -239,7 +105,7 @@
         <w:rPr>
           <w:b/>
         </w:rPr>
-        <w:t xml:space="preserve">Question 6: </w:t>
+        <w:t xml:space="preserve">Question 2: </w:t>
       </w:r>
       <w:r>
         <w:rPr>
@@ -248,16 +114,16 @@
         <w:t xml:space="preserve">A. </w:t>
       </w:r>
       <w:r>
-        <w:t>p</w:t>
+        <w:t>t</w:t>
       </w:r>
       <w:r>
         <w:rPr>
           <w:u w:val="single"/>
         </w:rPr>
-        <w:t>u</w:t>
+        <w:t>ow</w:t>
       </w:r>
       <w:r>
-        <w:t>llution</w:t>
+        <w:t>er</w:t>
       </w:r>
       <w:r>
         <w:tab/>
@@ -269,16 +135,16 @@
         <w:t xml:space="preserve">B. </w:t>
       </w:r>
       <w:r>
-        <w:t>b</w:t>
+        <w:t>cr</w:t>
       </w:r>
       <w:r>
         <w:rPr>
           <w:u w:val="single"/>
         </w:rPr>
-        <w:t>u</w:t>
+        <w:t>ow</w:t>
       </w:r>
       <w:r>
-        <w:t>sh</w:t>
+        <w:t>ded</w:t>
       </w:r>
       <w:r>
         <w:tab/>
@@ -290,16 +156,16 @@
         <w:t xml:space="preserve">C. </w:t>
       </w:r>
       <w:r>
-        <w:t>p</w:t>
+        <w:t>r</w:t>
       </w:r>
       <w:r>
         <w:rPr>
           <w:u w:val="single"/>
         </w:rPr>
-        <w:t>u</w:t>
+        <w:t>oa</w:t>
       </w:r>
       <w:r>
-        <w:t>t</w:t>
+        <w:t>d</w:t>
       </w:r>
       <w:r>
         <w:tab/>
@@ -311,16 +177,16 @@
         <w:t xml:space="preserve">D. </w:t>
       </w:r>
       <w:r>
-        <w:t>r</w:t>
+        <w:t>downt</w:t>
       </w:r>
       <w:r>
         <w:rPr>
           <w:u w:val="single"/>
         </w:rPr>
-        <w:t>u</w:t>
+        <w:t>ow</w:t>
       </w:r>
       <w:r>
-        <w:t>le</w:t>
+        <w:t>n</w:t>
       </w:r>
     </w:p>
     <w:p>
@@ -329,71 +195,7 @@
           <w:b/>
           <w:i/>
         </w:rPr>
-        <w:t>Read the following reading comprehension  and mark the letter A, B, C or D on your answer sheet to indicate the option that best fits each of the numbered blanks.</w:t>
-      </w:r>
-    </w:p>
-    <w:p>
-      <w:pPr>
-        <w:jc w:val="center"/>
-      </w:pPr>
-      <w:r>
-        <w:rPr>
-          <w:b/>
-        </w:rPr>
-        <w:t>A New Way to Shop</w:t>
-      </w:r>
-    </w:p>
-    <w:p>
-      <w:pPr>
-        <w:jc w:val="both"/>
-      </w:pPr>
-      <w:r>
-        <w:t xml:space="preserve">Mai enjoys shopping with her family at the weekend. They often go to a large mall in the city centre because it has many stores, a food court, and free parking. </w:t>
-      </w:r>
-      <w:r>
-        <w:rPr>
-          <w:b/>
-        </w:rPr>
-        <w:t>(7)______</w:t>
-      </w:r>
-      <w:r>
-        <w:t xml:space="preserve"> weekends, the mall is crowded, but Mai still likes the lively atmosphere. Her brother is more careful and reads product reviews before buying anything. Mai is less patient, so she usually makes a quick decision. Last month, she bought a </w:t>
-      </w:r>
-      <w:r>
-        <w:rPr>
-          <w:b/>
-        </w:rPr>
-        <w:t>(8)______</w:t>
-      </w:r>
-      <w:r>
-        <w:t xml:space="preserve"> handbag after comparing several brands. She was happy because it looked good and was also useful for school. Her mother </w:t>
-      </w:r>
-      <w:r>
-        <w:rPr>
-          <w:b/>
-        </w:rPr>
-        <w:t>(9)______</w:t>
-      </w:r>
-      <w:r>
-        <w:t xml:space="preserve"> checks prices in different shops to save money. She says smart shoppers should never buy the first thing they see. One day, Mai found a jacket she really liked, but she waited for a </w:t>
-      </w:r>
-      <w:r>
-        <w:rPr>
-          <w:b/>
-        </w:rPr>
-        <w:t>(10)______</w:t>
-      </w:r>
-      <w:r>
-        <w:t xml:space="preserve"> before buying it. She knew many shops reduce prices during special events. </w:t>
-      </w:r>
-      <w:r>
-        <w:rPr>
-          <w:b/>
-        </w:rPr>
-        <w:t>(11)______</w:t>
-      </w:r>
-      <w:r>
-        <w:t xml:space="preserve"> she finally returned to the store, the jacket was cheaper, so she bought it immediately.</w:t>
+        <w:t>Mark the letter A, B, C or D on your answer sheet to indicate the best arrangement of utterances or sentences to make a meaningful exchange or text.</w:t>
       </w:r>
     </w:p>
     <w:p>
@@ -401,124 +203,38 @@
         <w:rPr>
           <w:b/>
         </w:rPr>
-        <w:t xml:space="preserve">Question 7: </w:t>
-      </w:r>
-      <w:r>
-        <w:t>Question 7: Choose the best word to fill blank (7).</w:t>
+        <w:t>Question 3:</w:t>
       </w:r>
     </w:p>
     <w:p>
       <w:r>
-        <w:t>A. In</w:t>
-        <w:tab/>
-        <w:tab/>
-        <w:t>B. On</w:t>
-        <w:tab/>
-        <w:tab/>
-        <w:t>C. At</w:t>
-        <w:tab/>
-        <w:tab/>
-        <w:t>D. By</w:t>
+        <w:t>a. Lan: That sounds better than staying up late with my phone.</w:t>
+        <w:br/>
+        <w:br/>
+        <w:t>b. Mai: Why do you look so tired today, Lan?</w:t>
+        <w:br/>
+        <w:br/>
+        <w:t>c. Lan: I only slept about five hours because I watched videos until midnight.</w:t>
+        <w:br/>
+        <w:br/>
+        <w:t>d. Mai: You should put your phone away earlier and go to bed before 10:30.</w:t>
+        <w:br/>
+        <w:br/>
+        <w:t>e. Lan: I know. I couldn't focus in class this morning.</w:t>
       </w:r>
     </w:p>
     <w:p>
       <w:r>
-        <w:rPr>
-          <w:b/>
-        </w:rPr>
-        <w:t xml:space="preserve">Question 8: </w:t>
-      </w:r>
-      <w:r>
-        <w:t>Question 8: Choose the best word to fill blank (8).</w:t>
-      </w:r>
-    </w:p>
-    <w:p>
-      <w:r>
-        <w:t>A. fashion</w:t>
+        <w:t>A. b-c-e-d-a</w:t>
         <w:tab/>
         <w:tab/>
-        <w:t>B. fashionable</w:t>
+        <w:t>B. b-e-c-a-d</w:t>
         <w:tab/>
         <w:tab/>
-        <w:t>C. fashionably</w:t>
+        <w:t>C. e-b-c-d-a</w:t>
         <w:tab/>
         <w:tab/>
-        <w:t>D. fashions</w:t>
-      </w:r>
-    </w:p>
-    <w:p>
-      <w:r>
-        <w:rPr>
-          <w:b/>
-        </w:rPr>
-        <w:t xml:space="preserve">Question 9: </w:t>
-      </w:r>
-      <w:r>
-        <w:t>Question 9: Choose the best word to fill blank (9).</w:t>
-      </w:r>
-    </w:p>
-    <w:p>
-      <w:r>
-        <w:t>A. never</w:t>
-        <w:tab/>
-        <w:tab/>
-        <w:t>B. rarely</w:t>
-        <w:tab/>
-        <w:tab/>
-        <w:t>C. always</w:t>
-        <w:tab/>
-        <w:tab/>
-        <w:t>D. soon</w:t>
-      </w:r>
-    </w:p>
-    <w:p>
-      <w:r>
-        <w:rPr>
-          <w:b/>
-        </w:rPr>
-        <w:t xml:space="preserve">Question 10: </w:t>
-      </w:r>
-      <w:r>
-        <w:t>Question 10: Choose the best word to fill blank (10).</w:t>
-      </w:r>
-    </w:p>
-    <w:p>
-      <w:r>
-        <w:t>A. discount</w:t>
-        <w:tab/>
-        <w:tab/>
-        <w:t>B. customer</w:t>
-        <w:tab/>
-        <w:tab/>
-        <w:t>C. receipt</w:t>
-        <w:tab/>
-        <w:tab/>
-        <w:t>D. basket</w:t>
-      </w:r>
-    </w:p>
-    <w:p>
-      <w:r>
-        <w:rPr>
-          <w:b/>
-        </w:rPr>
-        <w:t xml:space="preserve">Question 11: </w:t>
-      </w:r>
-      <w:r>
-        <w:t>Question 11: Choose the best word to fill blank (11).</w:t>
-      </w:r>
-    </w:p>
-    <w:p>
-      <w:r>
-        <w:t>A. Although</w:t>
-        <w:tab/>
-        <w:tab/>
-        <w:t>B. Because</w:t>
-        <w:tab/>
-        <w:tab/>
-        <w:t>C. When</w:t>
-        <w:tab/>
-        <w:tab/>
-        <w:t>D. If</w:t>
+        <w:t>D. b-c-d-e-a</w:t>
       </w:r>
     </w:p>
     <w:p>
@@ -527,7 +243,7 @@
           <w:b/>
           <w:i/>
         </w:rPr>
-        <w:t>Mark the letter A, B, C, or D to indicate the underlined part that needs correction in the following questions.</w:t>
+        <w:t>Mark the letter A, B, C or D on your answer sheet to indicate the best arrangement of utterances or sentences to make a meaningful exchange or text.</w:t>
       </w:r>
     </w:p>
     <w:p>
@@ -535,126 +251,35 @@
         <w:rPr>
           <w:b/>
         </w:rPr>
-        <w:t xml:space="preserve">Question 12: </w:t>
-      </w:r>
-      <w:r>
-        <w:t xml:space="preserve">My brother </w:t>
-      </w:r>
-      <w:r>
-        <w:rPr>
-          <w:u w:val="single"/>
-        </w:rPr>
-        <w:t>often</w:t>
-      </w:r>
-      <w:r>
-        <w:rPr>
-          <w:u w:val="single"/>
-        </w:rPr>
-        <w:t>play</w:t>
-      </w:r>
-      <w:r>
-        <w:t xml:space="preserve"> badminton </w:t>
-      </w:r>
-      <w:r>
-        <w:rPr>
-          <w:u w:val="single"/>
-        </w:rPr>
-        <w:t>with his friends</w:t>
-      </w:r>
-      <w:r>
-        <w:t xml:space="preserve"> on </w:t>
-      </w:r>
-      <w:r>
-        <w:rPr>
-          <w:u w:val="single"/>
-        </w:rPr>
-        <w:t>Sunday afternoons</w:t>
-      </w:r>
-      <w:r>
-        <w:t>.</w:t>
-      </w:r>
-    </w:p>
-    <w:p>
-      <w:pPr>
-        <w:tabs>
-          <w:tab w:pos="2160" w:val="left"/>
-          <w:tab w:pos="3600" w:val="left"/>
-          <w:tab w:pos="3600" w:val="left"/>
-        </w:tabs>
-      </w:pPr>
-      <w:r>
-        <w:t>A. often</w:t>
-        <w:tab/>
-        <w:t>B. play</w:t>
-        <w:tab/>
-        <w:t>C. with his friends</w:t>
-        <w:tab/>
-        <w:t>D. Sunday afternoons</w:t>
+        <w:t>Question 4:</w:t>
       </w:r>
     </w:p>
     <w:p>
       <w:r>
-        <w:rPr>
-          <w:b/>
-        </w:rPr>
-        <w:t xml:space="preserve">Question 13: </w:t>
-      </w:r>
-      <w:r>
-        <w:t xml:space="preserve">The students </w:t>
-      </w:r>
-      <w:r>
-        <w:rPr>
-          <w:u w:val="single"/>
-        </w:rPr>
-        <w:t>was cleaning</w:t>
-      </w:r>
-      <w:r>
-        <w:t xml:space="preserve"> the beach when they </w:t>
-      </w:r>
-      <w:r>
-        <w:rPr>
-          <w:u w:val="single"/>
-        </w:rPr>
-        <w:t>found</w:t>
-      </w:r>
-      <w:r>
-        <w:t xml:space="preserve"> a lot of </w:t>
-      </w:r>
-      <w:r>
-        <w:rPr>
-          <w:u w:val="single"/>
-        </w:rPr>
-        <w:t>plastic bottles</w:t>
-      </w:r>
-      <w:r>
-        <w:t xml:space="preserve"> near </w:t>
-      </w:r>
-      <w:r>
-        <w:rPr>
-          <w:u w:val="single"/>
-        </w:rPr>
-        <w:t>the river</w:t>
-      </w:r>
-      <w:r>
-        <w:t>.</w:t>
+        <w:t>a. Mai: Really? What happened after you got there?</w:t>
+        <w:br/>
+        <w:br/>
+        <w:t>b. Nam: I had quite an unforgettable experience on my trip to Da Lat last weekend.</w:t>
+        <w:br/>
+        <w:br/>
+        <w:t>c. Mai: You look excited, Nam. Did anything special happen during your trip?</w:t>
+        <w:br/>
+        <w:br/>
+        <w:t>d. Nam: On the way to the hotel, we suddenly got lost in thick fog, but a local farmer showed us the right direction.</w:t>
       </w:r>
     </w:p>
     <w:p>
-      <w:pPr>
-        <w:tabs>
-          <w:tab w:pos="2160" w:val="left"/>
-          <w:tab w:pos="3600" w:val="left"/>
-          <w:tab w:pos="3600" w:val="left"/>
-        </w:tabs>
-      </w:pPr>
       <w:r>
-        <w:t>A. was cleaning</w:t>
+        <w:t>A. b-c-a-d</w:t>
         <w:tab/>
-        <w:t>B. found</w:t>
         <w:tab/>
-        <w:t>C. plastic bottles</w:t>
+        <w:t>B. c-b-a-d</w:t>
         <w:tab/>
-        <w:t>D. the river</w:t>
+        <w:tab/>
+        <w:t>C. c-a-b-d</w:t>
+        <w:tab/>
+        <w:tab/>
+        <w:t>D. b-a-c-d</w:t>
       </w:r>
     </w:p>
     <w:p>
@@ -670,10 +295,10 @@
         <w:rPr>
           <w:b/>
         </w:rPr>
-        <w:t xml:space="preserve">Question 14: </w:t>
+        <w:t xml:space="preserve">Question 5: </w:t>
       </w:r>
       <w:r>
-        <w:t>After the earthquake, many families had to ______ on bottled water until the local supply was restored.</w:t>
+        <w:t>My grandmother suggested ______ traditional dishes together during Tet so that the family could keep old customs alive.</w:t>
       </w:r>
     </w:p>
     <w:p>
@@ -685,13 +310,13 @@
         </w:tabs>
       </w:pPr>
       <w:r>
-        <w:t>A. go through</w:t>
+        <w:t>A. cook</w:t>
         <w:tab/>
-        <w:t>B. live on</w:t>
+        <w:t>B. to cook</w:t>
         <w:tab/>
-        <w:t>C. come across</w:t>
+        <w:t>C. cooking</w:t>
         <w:tab/>
-        <w:t>D. put off</w:t>
+        <w:t>D. cooked</w:t>
       </w:r>
     </w:p>
     <w:p>
@@ -699,10 +324,10 @@
         <w:rPr>
           <w:b/>
         </w:rPr>
-        <w:t xml:space="preserve">Question 15: </w:t>
+        <w:t xml:space="preserve">Question 6: </w:t>
       </w:r>
       <w:r>
-        <w:t>We usually visit our grandparents ______ Tet to follow our family tradition.</w:t>
+        <w:t>The rapid ______ of polar ice is one of the clearest signs of global warming.</w:t>
       </w:r>
     </w:p>
     <w:p>
@@ -714,13 +339,13 @@
         </w:tabs>
       </w:pPr>
       <w:r>
-        <w:t>A. on</w:t>
+        <w:t>A. melting</w:t>
         <w:tab/>
-        <w:t>B. at</w:t>
+        <w:t>B. melt</w:t>
         <w:tab/>
-        <w:t>C. in</w:t>
+        <w:t>C. melted</w:t>
         <w:tab/>
-        <w:t>D. from</w:t>
+        <w:t>D. melts</w:t>
       </w:r>
     </w:p>
     <w:p>
@@ -728,10 +353,10 @@
         <w:rPr>
           <w:b/>
         </w:rPr>
-        <w:t xml:space="preserve">Question 16: </w:t>
+        <w:t xml:space="preserve">Question 7: </w:t>
       </w:r>
       <w:r>
-        <w:t>People should move to a safe place before the storm ______ the coastal area.</w:t>
+        <w:t>I ______ many unforgettable experiences since I joined the school camping club.</w:t>
       </w:r>
     </w:p>
     <w:p>
@@ -743,13 +368,13 @@
         </w:tabs>
       </w:pPr>
       <w:r>
-        <w:t>A. reaches</w:t>
+        <w:t>A. have had</w:t>
         <w:tab/>
-        <w:t>B. reached</w:t>
+        <w:t>B. had</w:t>
         <w:tab/>
-        <w:t>C. will reach</w:t>
+        <w:t>C. has had</w:t>
         <w:tab/>
-        <w:t>D. is reaching</w:t>
+        <w:t>D. am having</w:t>
       </w:r>
     </w:p>
     <w:p>
@@ -757,10 +382,10 @@
         <w:rPr>
           <w:b/>
         </w:rPr>
-        <w:t xml:space="preserve">Question 17: </w:t>
+        <w:t xml:space="preserve">Question 8: </w:t>
       </w:r>
       <w:r>
-        <w:t>My brother ______ goes to bed late because he gets up early for school.</w:t>
+        <w:t>Teenagers ______ get at least eight hours of sleep each night to stay healthy and focused at school.</w:t>
       </w:r>
     </w:p>
     <w:p>
@@ -772,13 +397,13 @@
         </w:tabs>
       </w:pPr>
       <w:r>
-        <w:t>A. always</w:t>
+        <w:t>A. should</w:t>
         <w:tab/>
-        <w:t>B. never</w:t>
+        <w:t>B. mustn't</w:t>
         <w:tab/>
-        <w:t>C. sometimes</w:t>
+        <w:t>C. couldn't</w:t>
         <w:tab/>
-        <w:t>D. usually</w:t>
+        <w:t>D. would</w:t>
       </w:r>
     </w:p>
     <w:p>
@@ -786,10 +411,10 @@
         <w:rPr>
           <w:b/>
         </w:rPr>
-        <w:t xml:space="preserve">Question 18: </w:t>
+        <w:t xml:space="preserve">Question 9: </w:t>
       </w:r>
       <w:r>
-        <w:t>The village market ______ every Sunday morning, so we usually buy fresh vegetables there.</w:t>
+        <w:t>Many young people want to stay in their hometown and ______ the family business instead of moving to the city.</w:t>
       </w:r>
     </w:p>
     <w:p>
@@ -801,13 +426,13 @@
         </w:tabs>
       </w:pPr>
       <w:r>
-        <w:t>A. opens</w:t>
+        <w:t>A. take over</w:t>
         <w:tab/>
-        <w:t>B. is opening</w:t>
+        <w:t>B. take after</w:t>
         <w:tab/>
-        <w:t>C. open</w:t>
+        <w:t>C. take off</w:t>
         <w:tab/>
-        <w:t>D. opened</w:t>
+        <w:t>D. take up</w:t>
       </w:r>
     </w:p>
     <w:p>
@@ -815,10 +440,10 @@
         <w:rPr>
           <w:b/>
         </w:rPr>
-        <w:t xml:space="preserve">Question 19: </w:t>
+        <w:t xml:space="preserve">Question 10: </w:t>
       </w:r>
       <w:r>
-        <w:t>I called Minh at 8 p.m., but he ______ badminton with his friends at the sports center.</w:t>
+        <w:t>Only a few ______ in this store are compatible with the old charging system.</w:t>
       </w:r>
     </w:p>
     <w:p>
@@ -830,13 +455,13 @@
         </w:tabs>
       </w:pPr>
       <w:r>
-        <w:t>A. played</w:t>
+        <w:t>A. devices</w:t>
         <w:tab/>
-        <w:t>B. was playing</w:t>
+        <w:t>B. device</w:t>
         <w:tab/>
-        <w:t>C. has played</w:t>
+        <w:t>C. much devices</w:t>
         <w:tab/>
-        <w:t>D. plays</w:t>
+        <w:t>D. little device</w:t>
       </w:r>
     </w:p>
     <w:p>
@@ -844,10 +469,10 @@
         <w:rPr>
           <w:b/>
         </w:rPr>
-        <w:t xml:space="preserve">Question 20: </w:t>
+        <w:t xml:space="preserve">Question 11: </w:t>
       </w:r>
       <w:r>
-        <w:t>While I ______ for a cheaper jacket online, my sister found a great sale at the mall.</w:t>
+        <w:t>People in this local community are proud ______ their traditional craft village.</w:t>
       </w:r>
     </w:p>
     <w:p>
@@ -859,13 +484,13 @@
         </w:tabs>
       </w:pPr>
       <w:r>
-        <w:t>A. looked</w:t>
+        <w:t>A. of</w:t>
         <w:tab/>
-        <w:t>B. was looking</w:t>
+        <w:t>B. with</w:t>
         <w:tab/>
-        <w:t>C. am looking</w:t>
+        <w:t>C. from</w:t>
         <w:tab/>
-        <w:t>D. have looked</w:t>
+        <w:t>D. for</w:t>
       </w:r>
     </w:p>
     <w:p>
@@ -873,10 +498,10 @@
         <w:rPr>
           <w:b/>
         </w:rPr>
-        <w:t xml:space="preserve">Question 21: </w:t>
+        <w:t xml:space="preserve">Question 12: </w:t>
       </w:r>
       <w:r>
-        <w:t>After the earthquake, emergency teams worked through the night to ______ survivors trapped under the collapsed buildings.</w:t>
+        <w:t>The engineer ______ designed the new training program works for a large technology company.</w:t>
       </w:r>
     </w:p>
     <w:p>
@@ -888,13 +513,13 @@
         </w:tabs>
       </w:pPr>
       <w:r>
-        <w:t>A. rescue</w:t>
+        <w:t>A. who</w:t>
         <w:tab/>
-        <w:t>B. prevent</w:t>
+        <w:t>B. which</w:t>
         <w:tab/>
-        <w:t>C. predict</w:t>
+        <w:t>C. where</w:t>
         <w:tab/>
-        <w:t>D. scatter</w:t>
+        <w:t>D. when</w:t>
       </w:r>
     </w:p>
     <w:p>
@@ -902,10 +527,10 @@
         <w:rPr>
           <w:b/>
         </w:rPr>
-        <w:t xml:space="preserve">Question 22: </w:t>
+        <w:t xml:space="preserve">Question 13: </w:t>
       </w:r>
       <w:r>
-        <w:t>Many shoppers lined up early because the store was ______ a huge discount on all winter jackets.</w:t>
+        <w:t>Because English is spoken in many regions, learners should pay attention to local ______ such as pronunciation and word choice.</w:t>
       </w:r>
     </w:p>
     <w:p>
@@ -917,13 +542,13 @@
         </w:tabs>
       </w:pPr>
       <w:r>
-        <w:t>A. giving away</w:t>
+        <w:t>A. varieties</w:t>
         <w:tab/>
-        <w:t>B. bringing out</w:t>
+        <w:t>B. versions</w:t>
         <w:tab/>
-        <w:t>C. putting off</w:t>
+        <w:t>C. types</w:t>
         <w:tab/>
-        <w:t>D. turning down</w:t>
+        <w:t>D. models</w:t>
       </w:r>
     </w:p>
     <w:p>
@@ -931,10 +556,10 @@
         <w:rPr>
           <w:b/>
         </w:rPr>
-        <w:t xml:space="preserve">Question 23: </w:t>
+        <w:t xml:space="preserve">Question 14: </w:t>
       </w:r>
       <w:r>
-        <w:t>The government is encouraging the ______ use of natural resources to protect the environment.</w:t>
+        <w:t>Many tourists travel to Australia to see the Great Barrier Reef, one of the most amazing natural ______ in the world.</w:t>
       </w:r>
     </w:p>
     <w:p>
@@ -946,13 +571,13 @@
         </w:tabs>
       </w:pPr>
       <w:r>
-        <w:t>A. sustain</w:t>
+        <w:t>A. wonders</w:t>
         <w:tab/>
-        <w:t>B. sustainable</w:t>
+        <w:t>B. views</w:t>
         <w:tab/>
-        <w:t>C. sustainably</w:t>
+        <w:t>C. scenes</w:t>
         <w:tab/>
-        <w:t>D. sustainability</w:t>
+        <w:t>D. images</w:t>
       </w:r>
     </w:p>
     <w:p>
@@ -960,260 +585,10 @@
         <w:rPr>
           <w:b/>
         </w:rPr>
-        <w:t>Dialogue completion: Choose A, B, C or D to complete each dialogue.</w:t>
-      </w:r>
-    </w:p>
-    <w:p>
-      <w:r>
-        <w:rPr>
-          <w:b/>
-        </w:rPr>
-        <w:t xml:space="preserve">Question 24: </w:t>
-      </w:r>
-    </w:p>
-    <w:p>
-      <w:r>
-        <w:t>Mai: I'm trying to finish my project tonight. Could you help me check my slides?</w:t>
-      </w:r>
-    </w:p>
-    <w:p>
-      <w:r>
-        <w:t>______</w:t>
-      </w:r>
-    </w:p>
-    <w:p>
-      <w:pPr>
-        <w:tabs>
-          <w:tab w:pos="4320" w:val="left"/>
-        </w:tabs>
-      </w:pPr>
-      <w:r>
-        <w:t>A. Sure, send them to me and I'll look at them.</w:t>
-        <w:tab/>
-        <w:t>B. I checked my phone an hour ago.</w:t>
-      </w:r>
-    </w:p>
-    <w:p>
-      <w:pPr>
-        <w:tabs>
-          <w:tab w:pos="4320" w:val="left"/>
-        </w:tabs>
-      </w:pPr>
-      <w:r>
-        <w:t>C. Your slides are on the kitchen table.</w:t>
-        <w:tab/>
-        <w:t>D. No, I don't like school projects.</w:t>
-      </w:r>
-    </w:p>
-    <w:p>
-      <w:r>
-        <w:rPr>
-          <w:b/>
-        </w:rPr>
-        <w:t xml:space="preserve">Question 25: </w:t>
-      </w:r>
-    </w:p>
-    <w:p>
-      <w:r>
-        <w:t>Mai: Our village had a big flood last night.</w:t>
-      </w:r>
-    </w:p>
-    <w:p>
-      <w:r>
-        <w:t>______</w:t>
-      </w:r>
-    </w:p>
-    <w:p>
-      <w:pPr>
-        <w:tabs>
-          <w:tab w:pos="4320" w:val="left"/>
-        </w:tabs>
-      </w:pPr>
-      <w:r>
-        <w:t>A. I'm sorry to hear that.</w:t>
-        <w:tab/>
-        <w:t>B. That sounds delicious.</w:t>
-      </w:r>
-    </w:p>
-    <w:p>
-      <w:pPr>
-        <w:tabs>
-          <w:tab w:pos="4320" w:val="left"/>
-        </w:tabs>
-      </w:pPr>
-      <w:r>
-        <w:t>C. See you next week.</w:t>
-        <w:tab/>
-        <w:t>D. You're very kind.</w:t>
-      </w:r>
-    </w:p>
-    <w:p>
-      <w:r>
-        <w:rPr>
-          <w:b/>
-        </w:rPr>
-        <w:t>Rearrange the given words or phrases to make a meaningful sentence.</w:t>
-      </w:r>
-    </w:p>
-    <w:p>
-      <w:r>
-        <w:rPr>
-          <w:b/>
-        </w:rPr>
-        <w:t xml:space="preserve">Question 26: </w:t>
+        <w:t xml:space="preserve">Question 15: </w:t>
       </w:r>
       <w:r>
-        <w:t>starts/ the yoga class/ at 6 p.m./ on Friday/ ./</w:t>
-      </w:r>
-    </w:p>
-    <w:p>
-      <w:r>
-        <w:t>A. Starts the yoga class at 6 p.m. on Friday.</w:t>
-      </w:r>
-    </w:p>
-    <w:p>
-      <w:r>
-        <w:t>B. The yoga class starts at 6 p.m. on Friday.</w:t>
-      </w:r>
-    </w:p>
-    <w:p>
-      <w:r>
-        <w:t>C. On Friday starts the yoga class at 6 p.m.</w:t>
-      </w:r>
-    </w:p>
-    <w:p>
-      <w:r>
-        <w:t>D. The yoga class on Friday starts at 6 p.m.</w:t>
-      </w:r>
-    </w:p>
-    <w:p>
-      <w:r>
-        <w:rPr>
-          <w:b/>
-        </w:rPr>
-        <w:t xml:space="preserve">Question 27: </w:t>
-      </w:r>
-      <w:r>
-        <w:t>while/ my friends/ were playing/ online games/ ,/ I/ was reading/ a comic book/ ./</w:t>
-      </w:r>
-    </w:p>
-    <w:p>
-      <w:r>
-        <w:t>A. While my friends were playing online games, I was reading a comic book.</w:t>
-      </w:r>
-    </w:p>
-    <w:p>
-      <w:r>
-        <w:t>B. While were playing my friends online games, I was reading a comic book.</w:t>
-      </w:r>
-    </w:p>
-    <w:p>
-      <w:r>
-        <w:t>C. While my friends online games were playing, I was reading a comic book.</w:t>
-      </w:r>
-    </w:p>
-    <w:p>
-      <w:r>
-        <w:t>D. While my friends were playing online games, was reading I a comic book.</w:t>
-      </w:r>
-    </w:p>
-    <w:p>
-      <w:r>
-        <w:rPr>
-          <w:b/>
-        </w:rPr>
-        <w:t xml:space="preserve">Question 28: </w:t>
-      </w:r>
-      <w:r>
-        <w:t>doing/ were/ their homework/ quietly/ in the library/ the teenagers/ at 8 p.m./ .</w:t>
-      </w:r>
-    </w:p>
-    <w:p>
-      <w:r>
-        <w:t>A. Doing were their homework quietly in the library the teenagers at 8 p.m.</w:t>
-      </w:r>
-    </w:p>
-    <w:p>
-      <w:r>
-        <w:t>B. The teenagers were doing their homework quietly in the library at 8 p.m.</w:t>
-      </w:r>
-    </w:p>
-    <w:p>
-      <w:r>
-        <w:t>C. The teenagers quietly were doing their homework at 8 p.m. in the library.</w:t>
-      </w:r>
-    </w:p>
-    <w:p>
-      <w:r>
-        <w:t>D. At 8 p.m. the teenagers doing were their homework quietly in the library.</w:t>
-      </w:r>
-    </w:p>
-    <w:p>
-      <w:r>
-        <w:rPr>
-          <w:b/>
-        </w:rPr>
-        <w:t>Sentence rewriting: Choose A, B, C or D that has the CLOSEST meaning to the given sentence in each question.</w:t>
-      </w:r>
-    </w:p>
-    <w:p>
-      <w:r>
-        <w:rPr>
-          <w:b/>
-        </w:rPr>
-        <w:t xml:space="preserve">Question 29: </w:t>
-      </w:r>
-      <w:r>
-        <w:t>Lan will visit her grandmother next weekend.</w:t>
-      </w:r>
-    </w:p>
-    <w:p>
-      <w:r>
-        <w:t>A. Lan is visiting her grandmother next weekend.</w:t>
-      </w:r>
-    </w:p>
-    <w:p>
-      <w:r>
-        <w:t>B. Lan is going to visit her grandmother last weekend.</w:t>
-      </w:r>
-    </w:p>
-    <w:p>
-      <w:r>
-        <w:t>C. Lan will be visited by her grandmother next weekend.</w:t>
-      </w:r>
-    </w:p>
-    <w:p>
-      <w:r>
-        <w:t>D. Lan is going to visit her grandmother next weekend.</w:t>
-      </w:r>
-    </w:p>
-    <w:p>
-      <w:r>
-        <w:rPr>
-          <w:b/>
-        </w:rPr>
-        <w:t>Synonyms: Choose A, B, C or D that has the CLOSEST meaning to the underlined word/phrase in each question.</w:t>
-      </w:r>
-    </w:p>
-    <w:p>
-      <w:r>
-        <w:rPr>
-          <w:b/>
-        </w:rPr>
-        <w:t xml:space="preserve">Question 30: </w:t>
-      </w:r>
-      <w:r>
-        <w:t xml:space="preserve">People who live in the countryside often enjoy a </w:t>
-      </w:r>
-      <w:r>
-        <w:rPr>
-          <w:b/>
-          <w:u w:val="single"/>
-        </w:rPr>
-        <w:t>peaceful</w:t>
-      </w:r>
-      <w:r>
-        <w:t xml:space="preserve"> lifestyle, away from the noise and traffic of the city.</w:t>
+        <w:t>After graduating from university, Lan decided to apply for a ______ as a marketing assistant at a local company.</w:t>
       </w:r>
     </w:p>
     <w:p>
@@ -1225,13 +600,13 @@
         </w:tabs>
       </w:pPr>
       <w:r>
-        <w:t>A. quiet</w:t>
+        <w:t>A. position</w:t>
         <w:tab/>
-        <w:t>B. busy</w:t>
+        <w:t>B. career</w:t>
         <w:tab/>
-        <w:t>C. modern</w:t>
+        <w:t>C. profession</w:t>
         <w:tab/>
-        <w:t>D. crowded</w:t>
+        <w:t>D. trade</w:t>
       </w:r>
     </w:p>
     <w:p>
@@ -1239,20 +614,10 @@
         <w:rPr>
           <w:b/>
         </w:rPr>
-        <w:t xml:space="preserve">Question 31: </w:t>
+        <w:t xml:space="preserve">Question 16: </w:t>
       </w:r>
       <w:r>
-        <w:t xml:space="preserve">Many customers prefer to buy clothes during the end-of-season sale because the prices are </w:t>
-      </w:r>
-      <w:r>
-        <w:rPr>
-          <w:b/>
-          <w:u w:val="single"/>
-        </w:rPr>
-        <w:t>reasonable</w:t>
-      </w:r>
-      <w:r>
-        <w:t xml:space="preserve"> for most families.</w:t>
+        <w:t>Looking at the faded photographs, my grandmother became so ______ in her memories that she did not notice us entering the room.</w:t>
       </w:r>
     </w:p>
     <w:p>
@@ -1264,13 +629,13 @@
         </w:tabs>
       </w:pPr>
       <w:r>
-        <w:t>A. expensive</w:t>
+        <w:t>A. absorbed</w:t>
         <w:tab/>
-        <w:t>B. affordable</w:t>
+        <w:t>B. attached</w:t>
         <w:tab/>
-        <w:t>C. fashionable</w:t>
+        <w:t>C. concerned</w:t>
         <w:tab/>
-        <w:t>D. limited</w:t>
+        <w:t>D. involved</w:t>
       </w:r>
     </w:p>
     <w:p>
@@ -1279,7 +644,53 @@
           <w:b/>
           <w:i/>
         </w:rPr>
-        <w:t>Mark the letter A, B, C, or D on your answer sheet to indicate the word whose underlined part differs from the other three in pronunciation in each of the following questions.</w:t>
+        <w:t>Read the following announcement and mark the letter A, B, C or D on your answer sheet to indicate the option that best fits each of the numbered blanks.</w:t>
+      </w:r>
+    </w:p>
+    <w:p>
+      <w:pPr>
+        <w:jc w:val="center"/>
+      </w:pPr>
+      <w:r>
+        <w:rPr>
+          <w:b/>
+        </w:rPr>
+        <w:t>Announcement: Career Orientation Day</w:t>
+      </w:r>
+    </w:p>
+    <w:p>
+      <w:pPr>
+        <w:jc w:val="both"/>
+      </w:pPr>
+      <w:r>
+        <w:t xml:space="preserve">All students are invited to attend </w:t>
+      </w:r>
+      <w:r>
+        <w:rPr>
+          <w:b/>
+        </w:rPr>
+        <w:t>(1)______</w:t>
+      </w:r>
+      <w:r>
+        <w:t xml:space="preserve"> Career Orientation Day on Friday, 24 May, in the school hall from 8:00 a.m. to 11:30 a.m. The event will include talks by guest speakers, career games, and useful information about different jobs. Students can also receive </w:t>
+      </w:r>
+      <w:r>
+        <w:rPr>
+          <w:b/>
+        </w:rPr>
+        <w:t>(2)______</w:t>
+      </w:r>
+      <w:r>
+        <w:t xml:space="preserve"> advice from teachers and visitors. This activity is especially helpful for those who are still unsure about their future plans. Please arrive on time and bring a notebook, </w:t>
+      </w:r>
+      <w:r>
+        <w:rPr>
+          <w:b/>
+        </w:rPr>
+        <w:t>(3)______</w:t>
+      </w:r>
+      <w:r>
+        <w:t xml:space="preserve"> you can write down important ideas and questions during the program.</w:t>
       </w:r>
     </w:p>
     <w:p>
@@ -1287,52 +698,21 @@
         <w:rPr>
           <w:b/>
         </w:rPr>
-        <w:t xml:space="preserve">Question 32: </w:t>
+        <w:t xml:space="preserve">Question 17: </w:t>
       </w:r>
+    </w:p>
+    <w:p>
       <w:r>
-        <w:rPr>
-          <w:b/>
-        </w:rPr>
-        <w:t xml:space="preserve">A. </w:t>
-      </w:r>
-      <w:r>
-        <w:t>volcano</w:t>
-      </w:r>
-      <w:r>
+        <w:t>A. a</w:t>
         <w:tab/>
-      </w:r>
-      <w:r>
-        <w:rPr>
-          <w:b/>
-        </w:rPr>
-        <w:t xml:space="preserve">B. </w:t>
-      </w:r>
-      <w:r>
-        <w:t>disaster</w:t>
-      </w:r>
-      <w:r>
         <w:tab/>
-      </w:r>
-      <w:r>
-        <w:rPr>
-          <w:b/>
-        </w:rPr>
-        <w:t xml:space="preserve">C. </w:t>
-      </w:r>
-      <w:r>
-        <w:t>hurricane</w:t>
-      </w:r>
-      <w:r>
+        <w:t>B. an</w:t>
         <w:tab/>
-      </w:r>
-      <w:r>
-        <w:rPr>
-          <w:b/>
-        </w:rPr>
-        <w:t xml:space="preserve">D. </w:t>
-      </w:r>
-      <w:r>
-        <w:t>erosion</w:t>
+        <w:tab/>
+        <w:t>C. the</w:t>
+        <w:tab/>
+        <w:tab/>
+        <w:t>D. Ø</w:t>
       </w:r>
     </w:p>
     <w:p>
@@ -1340,52 +720,21 @@
         <w:rPr>
           <w:b/>
         </w:rPr>
-        <w:t xml:space="preserve">Question 33: </w:t>
+        <w:t xml:space="preserve">Question 18: </w:t>
       </w:r>
+    </w:p>
+    <w:p>
       <w:r>
-        <w:rPr>
-          <w:b/>
-        </w:rPr>
-        <w:t xml:space="preserve">A. </w:t>
-      </w:r>
-      <w:r>
-        <w:t>device</w:t>
-      </w:r>
-      <w:r>
+        <w:t>A. person</w:t>
         <w:tab/>
-      </w:r>
-      <w:r>
-        <w:rPr>
-          <w:b/>
-        </w:rPr>
-        <w:t xml:space="preserve">B. </w:t>
-      </w:r>
-      <w:r>
-        <w:t>online</w:t>
-      </w:r>
-      <w:r>
         <w:tab/>
-      </w:r>
-      <w:r>
-        <w:rPr>
-          <w:b/>
-        </w:rPr>
-        <w:t xml:space="preserve">C. </w:t>
-      </w:r>
-      <w:r>
-        <w:t>comment</w:t>
-      </w:r>
-      <w:r>
+        <w:t>B. personal</w:t>
         <w:tab/>
-      </w:r>
-      <w:r>
-        <w:rPr>
-          <w:b/>
-        </w:rPr>
-        <w:t xml:space="preserve">D. </w:t>
-      </w:r>
-      <w:r>
-        <w:t>connect</w:t>
+        <w:tab/>
+        <w:t>C. personally</w:t>
+        <w:tab/>
+        <w:tab/>
+        <w:t>D. personalize</w:t>
       </w:r>
     </w:p>
     <w:p>
@@ -1393,7 +742,91 @@
         <w:rPr>
           <w:b/>
         </w:rPr>
-        <w:t>Synonyms: Choose A, B, C or D that has the CLOSEST meaning to the underlined word/phrase in each question.</w:t>
+        <w:t xml:space="preserve">Question 19: </w:t>
+      </w:r>
+    </w:p>
+    <w:p>
+      <w:r>
+        <w:t>A. but</w:t>
+        <w:tab/>
+        <w:tab/>
+        <w:t>B. or</w:t>
+        <w:tab/>
+        <w:tab/>
+        <w:t>C. so</w:t>
+        <w:tab/>
+        <w:tab/>
+        <w:t>D. because</w:t>
+      </w:r>
+    </w:p>
+    <w:p>
+      <w:r>
+        <w:rPr>
+          <w:b/>
+          <w:i/>
+        </w:rPr>
+        <w:t>Read the following paragraph and mark the letter A, B, C or D on your answer sheet to indicate the option that best fits each of the numbered blanks.</w:t>
+      </w:r>
+    </w:p>
+    <w:p>
+      <w:pPr>
+        <w:jc w:val="both"/>
+      </w:pPr>
+      <w:r>
+        <w:t xml:space="preserve">Ecotourism is becoming more popular as travelers look for ways to enjoy nature without harming it. Unlike mass tourism, this kind of travel tries to protect local culture and the environment. Visitors often stay in small family-run places and join activities that </w:t>
+      </w:r>
+      <w:r>
+        <w:rPr>
+          <w:b/>
+        </w:rPr>
+        <w:t>(1)______</w:t>
+      </w:r>
+      <w:r>
+        <w:t xml:space="preserve"> local people. They may learn how food is grown, walk with trained guides, or help clean a beach. These experiences are enjoyable, </w:t>
+      </w:r>
+      <w:r>
+        <w:rPr>
+          <w:b/>
+        </w:rPr>
+        <w:t>(2)______</w:t>
+      </w:r>
+      <w:r>
+        <w:t xml:space="preserve"> they also teach tourists to be more responsible.</w:t>
+      </w:r>
+    </w:p>
+    <w:p>
+      <w:pPr>
+        <w:jc w:val="both"/>
+      </w:pPr>
+      <w:r>
+        <w:t xml:space="preserve">Good ecotourism brings economic and environmental benefits. For example, money from tours can support forest protection and create jobs for villagers. It can also raise </w:t>
+      </w:r>
+      <w:r>
+        <w:rPr>
+          <w:b/>
+        </w:rPr>
+        <w:t>(3)______</w:t>
+      </w:r>
+      <w:r>
+        <w:t xml:space="preserve"> of endangered animals and natural areas. However, ecotourism is not always perfect. If too many people visit one place, the area may become crowded and noisy. To avoid this, travelers should choose companies with a good </w:t>
+      </w:r>
+      <w:r>
+        <w:rPr>
+          <w:b/>
+        </w:rPr>
+        <w:t>(4)______</w:t>
+      </w:r>
+      <w:r>
+        <w:t xml:space="preserve"> and follow local rules. They should also be respectful </w:t>
+      </w:r>
+      <w:r>
+        <w:rPr>
+          <w:b/>
+        </w:rPr>
+        <w:t>(5)______</w:t>
+      </w:r>
+      <w:r>
+        <w:t xml:space="preserve"> wildlife by keeping a safe distance and leaving no litter behind.</w:t>
       </w:r>
     </w:p>
     <w:p>
@@ -1401,38 +834,24 @@
         <w:rPr>
           <w:b/>
         </w:rPr>
-        <w:t xml:space="preserve">Question 34: </w:t>
+        <w:t xml:space="preserve">Question 20: </w:t>
       </w:r>
       <w:r>
-        <w:t xml:space="preserve">This online shop is very </w:t>
-      </w:r>
-      <w:r>
-        <w:rPr>
-          <w:b/>
-          <w:u w:val="single"/>
-        </w:rPr>
-        <w:t>popular</w:t>
-      </w:r>
-      <w:r>
-        <w:t xml:space="preserve"> with teenagers because it sells cheap and trendy clothes.</w:t>
+        <w:t>Question 20: Choose the best word to fill blank (1).</w:t>
       </w:r>
     </w:p>
     <w:p>
-      <w:pPr>
-        <w:tabs>
-          <w:tab w:pos="2160" w:val="left"/>
-          <w:tab w:pos="3600" w:val="left"/>
-          <w:tab w:pos="3600" w:val="left"/>
-        </w:tabs>
-      </w:pPr>
       <w:r>
-        <w:t>A. famous</w:t>
+        <w:t>A. benefit</w:t>
         <w:tab/>
-        <w:t>B. empty</w:t>
         <w:tab/>
-        <w:t>C. careful</w:t>
+        <w:t>B. damage</w:t>
         <w:tab/>
-        <w:t>D. private</w:t>
+        <w:tab/>
+        <w:t>C. refuse</w:t>
+        <w:tab/>
+        <w:tab/>
+        <w:t>D. ignore</w:t>
       </w:r>
     </w:p>
     <w:p>
@@ -1440,38 +859,99 @@
         <w:rPr>
           <w:b/>
         </w:rPr>
-        <w:t xml:space="preserve">Question 35: </w:t>
+        <w:t xml:space="preserve">Question 21: </w:t>
       </w:r>
       <w:r>
-        <w:t xml:space="preserve">After the earthquake, many families had to leave their homes because the buildings were </w:t>
+        <w:t>Question 21: Choose the best word to fill blank (2).</w:t>
       </w:r>
+    </w:p>
+    <w:p>
+      <w:r>
+        <w:t>A. or</w:t>
+        <w:tab/>
+        <w:tab/>
+        <w:t>B. but</w:t>
+        <w:tab/>
+        <w:tab/>
+        <w:t>C. so</w:t>
+        <w:tab/>
+        <w:tab/>
+        <w:t>D. because</w:t>
+      </w:r>
+    </w:p>
+    <w:p>
       <w:r>
         <w:rPr>
           <w:b/>
-          <w:u w:val="single"/>
         </w:rPr>
-        <w:t>unsafe</w:t>
+        <w:t xml:space="preserve">Question 22: </w:t>
       </w:r>
       <w:r>
-        <w:t xml:space="preserve"> to live in.</w:t>
+        <w:t>Question 22: Choose the best word to fill blank (3).</w:t>
       </w:r>
     </w:p>
     <w:p>
-      <w:pPr>
-        <w:tabs>
-          <w:tab w:pos="2160" w:val="left"/>
-          <w:tab w:pos="3600" w:val="left"/>
-          <w:tab w:pos="3600" w:val="left"/>
-        </w:tabs>
-      </w:pPr>
       <w:r>
-        <w:t>A. dangerous</w:t>
+        <w:t>A. aware</w:t>
         <w:tab/>
-        <w:t>B. empty</w:t>
         <w:tab/>
-        <w:t>C. modern</w:t>
+        <w:t>B. awareness</w:t>
         <w:tab/>
-        <w:t>D. quiet</w:t>
+        <w:tab/>
+        <w:t>C. awaring</w:t>
+        <w:tab/>
+        <w:tab/>
+        <w:t>D. awared</w:t>
+      </w:r>
+    </w:p>
+    <w:p>
+      <w:r>
+        <w:rPr>
+          <w:b/>
+        </w:rPr>
+        <w:t xml:space="preserve">Question 23: </w:t>
+      </w:r>
+      <w:r>
+        <w:t>Question 23: Choose the best word to fill blank (4).</w:t>
+      </w:r>
+    </w:p>
+    <w:p>
+      <w:r>
+        <w:t>A. habit</w:t>
+        <w:tab/>
+        <w:tab/>
+        <w:t>B. memory</w:t>
+        <w:tab/>
+        <w:tab/>
+        <w:t>C. reputation</w:t>
+        <w:tab/>
+        <w:tab/>
+        <w:t>D. scene</w:t>
+      </w:r>
+    </w:p>
+    <w:p>
+      <w:r>
+        <w:rPr>
+          <w:b/>
+        </w:rPr>
+        <w:t xml:space="preserve">Question 24: </w:t>
+      </w:r>
+      <w:r>
+        <w:t>Question 24: Choose the best word to fill blank (5).</w:t>
+      </w:r>
+    </w:p>
+    <w:p>
+      <w:r>
+        <w:t>A. for</w:t>
+        <w:tab/>
+        <w:tab/>
+        <w:t>B. with</w:t>
+        <w:tab/>
+        <w:tab/>
+        <w:t>C. about</w:t>
+        <w:tab/>
+        <w:tab/>
+        <w:t>D. of</w:t>
       </w:r>
     </w:p>
     <w:p>
@@ -1491,7 +971,7 @@
         <w:rPr>
           <w:b/>
         </w:rPr>
-        <w:t>Staying Safe in Natural Disasters</w:t>
+        <w:t>Technology and Learning</w:t>
       </w:r>
     </w:p>
     <w:p>
@@ -1499,7 +979,7 @@
         <w:jc w:val="both"/>
       </w:pPr>
       <w:r>
-        <w:t>P1. Natural disasters can happen suddenly and cause serious damage. Floods, earthquakes, and storms are some common examples. They may destroy homes, cut off roads, and leave people without electricity or clean water.</w:t>
+        <w:t>P1. Technology has changed the way many students learn. In the past, they often depended only on textbooks and classroom lessons. Today, they can watch videos, join online classes, and use learning apps at home or at school. These tools give learners more ways to study the same topic.</w:t>
       </w:r>
     </w:p>
     <w:p>
@@ -1507,7 +987,17 @@
         <w:jc w:val="both"/>
       </w:pPr>
       <w:r>
-        <w:t>P2. Because of this, families should prepare before a disaster happens. They need to keep enough food and water, a flashlight, and basic medicine in a safe place. It is also important to learn where to go and how to contact each other in an emergency.</w:t>
+        <w:t xml:space="preserve">P2. One clear benefit is that students can learn at their own speed. If a lesson is difficult, they can pause a video or read the material again. Technology also makes lessons more </w:t>
+      </w:r>
+      <w:r>
+        <w:rPr>
+          <w:b/>
+          <w:u w:val="single"/>
+        </w:rPr>
+        <w:t>interesting</w:t>
+      </w:r>
+      <w:r>
+        <w:t xml:space="preserve"> through pictures, sound, and games. As a result, some students feel more motivated to study.</w:t>
       </w:r>
     </w:p>
     <w:p>
@@ -1515,25 +1005,14 @@
         <w:jc w:val="both"/>
       </w:pPr>
       <w:r>
-        <w:t xml:space="preserve">P3. During a disaster, people should stay calm and follow official instructions. For example, if there is a flood warning, they should move to higher ground. If an earthquake happens, they should protect their head and stay away from windows. Quick and </w:t>
+        <w:t xml:space="preserve">P3. However, technology also brings problems. Some students are easily distracted by social media or online games when they should be studying. Others may have trouble if they do not have a good internet connection or a suitable device. </w:t>
       </w:r>
       <w:r>
         <w:rPr>
           <w:b/>
           <w:u w:val="single"/>
         </w:rPr>
-        <w:t>rapid</w:t>
-      </w:r>
-      <w:r>
-        <w:t xml:space="preserve"> action can save lives.</w:t>
-      </w:r>
-    </w:p>
-    <w:p>
-      <w:pPr>
-        <w:jc w:val="both"/>
-      </w:pPr>
-      <w:r>
-        <w:t>P4. After the danger ends, people may still face many problems. Some buildings can be unsafe, and streets may be blocked. However, communities often work together to help one another and rebuild their lives.</w:t>
+        <w:t>For this reason, technology works best when students use it carefully and teachers guide them in the right way.</w:t>
       </w:r>
     </w:p>
     <w:p>
@@ -1541,30 +1020,30 @@
         <w:rPr>
           <w:b/>
         </w:rPr>
-        <w:t xml:space="preserve">Question 36: </w:t>
+        <w:t xml:space="preserve">Question 25: </w:t>
       </w:r>
       <w:r>
-        <w:t>What may happen after a natural disaster?</w:t>
+        <w:t>Which of the following is NOT mentioned as a way students learn with technology?</w:t>
       </w:r>
     </w:p>
     <w:p>
       <w:r>
-        <w:t>A. People may lose electricity and clean water.</w:t>
+        <w:t>A. Watching videos</w:t>
       </w:r>
     </w:p>
     <w:p>
       <w:r>
-        <w:t>B. People may learn a new language.</w:t>
+        <w:t>B. Joining online classes</w:t>
       </w:r>
     </w:p>
     <w:p>
       <w:r>
-        <w:t>C. People may travel more often.</w:t>
+        <w:t>C. Using learning apps</w:t>
       </w:r>
     </w:p>
     <w:p>
       <w:r>
-        <w:t>D. People may build larger houses immediately.</w:t>
+        <w:t>D. Doing science experiments in labs</w:t>
       </w:r>
     </w:p>
     <w:p>
@@ -1572,38 +1051,7 @@
         <w:rPr>
           <w:b/>
         </w:rPr>
-        <w:t xml:space="preserve">Question 37: </w:t>
-      </w:r>
-      <w:r>
-        <w:t>Why should families prepare before a disaster happens?</w:t>
-      </w:r>
-    </w:p>
-    <w:p>
-      <w:r>
-        <w:t>A. Because disasters always last for many months.</w:t>
-      </w:r>
-    </w:p>
-    <w:p>
-      <w:r>
-        <w:t>B. Because preparation helps them stay safer in emergencies.</w:t>
-      </w:r>
-    </w:p>
-    <w:p>
-      <w:r>
-        <w:t>C. Because they need to move to a new city.</w:t>
-      </w:r>
-    </w:p>
-    <w:p>
-      <w:r>
-        <w:t>D. Because official instructions are often incorrect.</w:t>
-      </w:r>
-    </w:p>
-    <w:p>
-      <w:r>
-        <w:rPr>
-          <w:b/>
-        </w:rPr>
-        <w:t xml:space="preserve">Question 38: </w:t>
+        <w:t xml:space="preserve">Question 26: </w:t>
       </w:r>
       <w:r>
         <w:t xml:space="preserve">The word </w:t>
@@ -1616,33 +1064,477 @@
           <w:b/>
           <w:u w:val="single"/>
         </w:rPr>
-        <w:t>rapid</w:t>
+        <w:t>interesting</w:t>
       </w:r>
       <w:r>
         <w:t>"</w:t>
       </w:r>
       <w:r>
-        <w:t xml:space="preserve"> in paragraph 3 is closest in meaning to ______.</w:t>
+        <w:t xml:space="preserve"> in paragraph 2 is closest in meaning to ______.</w:t>
       </w:r>
     </w:p>
     <w:p>
       <w:r>
-        <w:t>A. slow</w:t>
+        <w:t>A. boring</w:t>
       </w:r>
     </w:p>
     <w:p>
       <w:r>
-        <w:t>B. careful</w:t>
+        <w:t>B. engaging</w:t>
       </w:r>
     </w:p>
     <w:p>
       <w:r>
-        <w:t>C. quick</w:t>
+        <w:t>C. traditional</w:t>
       </w:r>
     </w:p>
     <w:p>
       <w:r>
-        <w:t>D. possible</w:t>
+        <w:t>D. difficult</w:t>
+      </w:r>
+    </w:p>
+    <w:p>
+      <w:r>
+        <w:rPr>
+          <w:b/>
+        </w:rPr>
+        <w:t xml:space="preserve">Question 27: </w:t>
+      </w:r>
+      <w:r>
+        <w:t xml:space="preserve">In paragraph 2, the word </w:t>
+      </w:r>
+      <w:r>
+        <w:t>"</w:t>
+      </w:r>
+      <w:r>
+        <w:rPr>
+          <w:b/>
+          <w:u w:val="single"/>
+        </w:rPr>
+        <w:t>they</w:t>
+      </w:r>
+      <w:r>
+        <w:t>"</w:t>
+      </w:r>
+      <w:r>
+        <w:t xml:space="preserve"> refers to ______.</w:t>
+      </w:r>
+    </w:p>
+    <w:p>
+      <w:r>
+        <w:t>A. students</w:t>
+      </w:r>
+    </w:p>
+    <w:p>
+      <w:r>
+        <w:t>B. videos</w:t>
+      </w:r>
+    </w:p>
+    <w:p>
+      <w:r>
+        <w:t>C. lessons</w:t>
+      </w:r>
+    </w:p>
+    <w:p>
+      <w:r>
+        <w:t>D. apps</w:t>
+      </w:r>
+    </w:p>
+    <w:p>
+      <w:r>
+        <w:rPr>
+          <w:b/>
+        </w:rPr>
+        <w:t xml:space="preserve">Question 28: </w:t>
+      </w:r>
+      <w:r>
+        <w:t xml:space="preserve">The word </w:t>
+      </w:r>
+      <w:r>
+        <w:t>"</w:t>
+      </w:r>
+      <w:r>
+        <w:rPr>
+          <w:b/>
+          <w:u w:val="single"/>
+        </w:rPr>
+        <w:t>difficult</w:t>
+      </w:r>
+      <w:r>
+        <w:t>"</w:t>
+      </w:r>
+      <w:r>
+        <w:t xml:space="preserve"> in paragraph 2 is closest in meaning to the opposite of ______.</w:t>
+      </w:r>
+    </w:p>
+    <w:p>
+      <w:r>
+        <w:t>A. easy</w:t>
+      </w:r>
+    </w:p>
+    <w:p>
+      <w:r>
+        <w:t>B. useful</w:t>
+      </w:r>
+    </w:p>
+    <w:p>
+      <w:r>
+        <w:t>C. modern</w:t>
+      </w:r>
+    </w:p>
+    <w:p>
+      <w:r>
+        <w:t>D. careful</w:t>
+      </w:r>
+    </w:p>
+    <w:p>
+      <w:r>
+        <w:rPr>
+          <w:b/>
+        </w:rPr>
+        <w:t xml:space="preserve">Question 29: </w:t>
+      </w:r>
+      <w:r>
+        <w:t>According to the passage, some students feel more motivated to study because technology ______.</w:t>
+      </w:r>
+    </w:p>
+    <w:p>
+      <w:r>
+        <w:t>A. replaces all classroom lessons</w:t>
+      </w:r>
+    </w:p>
+    <w:p>
+      <w:r>
+        <w:t>B. allows them to finish school earlier</w:t>
+      </w:r>
+    </w:p>
+    <w:p>
+      <w:r>
+        <w:t>C. makes lessons more attractive with pictures, sound, and games</w:t>
+      </w:r>
+    </w:p>
+    <w:p>
+      <w:r>
+        <w:t>D. stops them from using social media</w:t>
+      </w:r>
+    </w:p>
+    <w:p>
+      <w:r>
+        <w:rPr>
+          <w:b/>
+        </w:rPr>
+        <w:t xml:space="preserve">Question 30: </w:t>
+      </w:r>
+      <w:r>
+        <w:t>What is the main idea of paragraph 3?</w:t>
+      </w:r>
+    </w:p>
+    <w:p>
+      <w:r>
+        <w:t>A. Technology always causes more harm than good in education.</w:t>
+      </w:r>
+    </w:p>
+    <w:p>
+      <w:r>
+        <w:t>B. Technology can create problems, so it should be used carefully with teacher support.</w:t>
+      </w:r>
+    </w:p>
+    <w:p>
+      <w:r>
+        <w:t>C. Students should only study with the internet at home.</w:t>
+      </w:r>
+    </w:p>
+    <w:p>
+      <w:r>
+        <w:t>D. Online games are the most useful part of learning technology.</w:t>
+      </w:r>
+    </w:p>
+    <w:p>
+      <w:r>
+        <w:rPr>
+          <w:b/>
+        </w:rPr>
+        <w:t>Sentence rewriting: Choose A, B, C or D that has the CLOSEST meaning to the given sentence in each question.</w:t>
+      </w:r>
+    </w:p>
+    <w:p>
+      <w:r>
+        <w:rPr>
+          <w:b/>
+        </w:rPr>
+        <w:t xml:space="preserve">Question 31: </w:t>
+      </w:r>
+      <w:r>
+        <w:t>I don't have a laptop, so I can't work from home more easily.</w:t>
+      </w:r>
+    </w:p>
+    <w:p>
+      <w:r>
+        <w:t>A. I wish I had a laptop so that I could work from home more easily.</w:t>
+      </w:r>
+    </w:p>
+    <w:p>
+      <w:r>
+        <w:t>B. I wish I have a laptop so that I can work from home more easily.</w:t>
+      </w:r>
+    </w:p>
+    <w:p>
+      <w:r>
+        <w:t>C. I wish I had had a laptop so that I could work from home more easily.</w:t>
+      </w:r>
+    </w:p>
+    <w:p>
+      <w:r>
+        <w:t>D. I wish I didn't have a laptop so that I could work from home more easily.</w:t>
+      </w:r>
+    </w:p>
+    <w:p>
+      <w:r>
+        <w:rPr>
+          <w:b/>
+        </w:rPr>
+        <w:t xml:space="preserve">Question 32: </w:t>
+      </w:r>
+      <w:r>
+        <w:t>The manager said, "We will launch the new training program next month."</w:t>
+      </w:r>
+    </w:p>
+    <w:p>
+      <w:r>
+        <w:t>A. The manager said that they would launch the new training program the following month.</w:t>
+      </w:r>
+    </w:p>
+    <w:p>
+      <w:r>
+        <w:t>B. The manager said that they will launch the new training program the following month.</w:t>
+      </w:r>
+    </w:p>
+    <w:p>
+      <w:r>
+        <w:t>C. The manager said that we would launch the new training program next month.</w:t>
+      </w:r>
+    </w:p>
+    <w:p>
+      <w:r>
+        <w:t>D. The manager said they launched the new training program the following month.</w:t>
+      </w:r>
+    </w:p>
+    <w:p>
+      <w:r>
+        <w:rPr>
+          <w:b/>
+        </w:rPr>
+        <w:t xml:space="preserve">Question 33: </w:t>
+      </w:r>
+      <w:r>
+        <w:t>This online course is more useful than the one I took last summer.</w:t>
+      </w:r>
+    </w:p>
+    <w:p>
+      <w:r>
+        <w:t>A. The online course I took last summer was as useful as this one.</w:t>
+      </w:r>
+    </w:p>
+    <w:p>
+      <w:r>
+        <w:t>B. The one I took last summer was not as useful as this online course.</w:t>
+      </w:r>
+    </w:p>
+    <w:p>
+      <w:r>
+        <w:t>C. The one I took last summer was more useful than this online course.</w:t>
+      </w:r>
+    </w:p>
+    <w:p>
+      <w:r>
+        <w:t>D. This online course is not as useful as the one I took last summer.</w:t>
+      </w:r>
+    </w:p>
+    <w:p>
+      <w:r>
+        <w:rPr>
+          <w:b/>
+        </w:rPr>
+        <w:t>Sentence combination: Choose A, B, C or D that has the CLOSEST meaning to the given pair of sentences in each question.</w:t>
+      </w:r>
+    </w:p>
+    <w:p>
+      <w:r>
+        <w:rPr>
+          <w:b/>
+        </w:rPr>
+        <w:t xml:space="preserve">Question 34: </w:t>
+      </w:r>
+      <w:r>
+        <w:t>The school picnic was canceled. Because of the heavy rain, the park was unsafe.</w:t>
+      </w:r>
+    </w:p>
+    <w:p>
+      <w:r>
+        <w:t>A. The school picnic was canceled because the park was unsafe because of the heavy rain.</w:t>
+      </w:r>
+    </w:p>
+    <w:p>
+      <w:r>
+        <w:t>B. Because of the heavy rain, the school picnic was canceled although the park was unsafe.</w:t>
+      </w:r>
+    </w:p>
+    <w:p>
+      <w:r>
+        <w:t>C. The school picnic was canceled because of the park was unsafe in the heavy rain.</w:t>
+      </w:r>
+    </w:p>
+    <w:p>
+      <w:r>
+        <w:t>D. Because of the heavy rain, the park was unsafe, so the school picnic was canceled.</w:t>
+      </w:r>
+    </w:p>
+    <w:p>
+      <w:r>
+        <w:rPr>
+          <w:b/>
+        </w:rPr>
+        <w:t>Sentence rewriting: Choose A, B, C or D that has the CLOSEST meaning to the given sentence in each question.</w:t>
+      </w:r>
+    </w:p>
+    <w:p>
+      <w:r>
+        <w:rPr>
+          <w:b/>
+        </w:rPr>
+        <w:t xml:space="preserve">Question 35: </w:t>
+      </w:r>
+      <w:r>
+        <w:t>If people use public transport more often, the air in big cities will be cleaner.</w:t>
+      </w:r>
+    </w:p>
+    <w:p>
+      <w:r>
+        <w:t>A. The air in big cities will be cleaner if people use public transport more often.</w:t>
+      </w:r>
+    </w:p>
+    <w:p>
+      <w:r>
+        <w:t>B. The air in big cities would be cleaner if people used public transport more often.</w:t>
+      </w:r>
+    </w:p>
+    <w:p>
+      <w:r>
+        <w:t>C. If people used public transport more often, the air in big cities will be cleaner.</w:t>
+      </w:r>
+    </w:p>
+    <w:p>
+      <w:r>
+        <w:t>D. The air in big cities is cleaner if people will use public transport more often.</w:t>
+      </w:r>
+    </w:p>
+    <w:p>
+      <w:r>
+        <w:rPr>
+          <w:b/>
+        </w:rPr>
+        <w:t xml:space="preserve">Question 36: </w:t>
+      </w:r>
+      <w:r>
+        <w:t>As cities become more crowded, housing becomes more expensive.</w:t>
+      </w:r>
+    </w:p>
+    <w:p>
+      <w:r>
+        <w:t>A. The more crowded cities become, the more expensive housing becomes.</w:t>
+      </w:r>
+    </w:p>
+    <w:p>
+      <w:r>
+        <w:t>B. Cities become more crowded because housing becomes more expensive.</w:t>
+      </w:r>
+    </w:p>
+    <w:p>
+      <w:r>
+        <w:t>C. The more crowded cities become, housing becomes less expensive.</w:t>
+      </w:r>
+    </w:p>
+    <w:p>
+      <w:r>
+        <w:t>D. Housing becomes more expensive than cities become more crowded.</w:t>
+      </w:r>
+    </w:p>
+    <w:p>
+      <w:r>
+        <w:rPr>
+          <w:b/>
+        </w:rPr>
+        <w:t xml:space="preserve">Question 37: </w:t>
+      </w:r>
+      <w:r>
+        <w:t>The online workshop was so useful that many young employees applied its ideas immediately.</w:t>
+      </w:r>
+    </w:p>
+    <w:p>
+      <w:r>
+        <w:t>A. It was such a useful online workshop that many young employees applied its ideas immediately.</w:t>
+      </w:r>
+    </w:p>
+    <w:p>
+      <w:r>
+        <w:t>B. It was such useful an online workshop that many young employees applied its ideas immediately.</w:t>
+      </w:r>
+    </w:p>
+    <w:p>
+      <w:r>
+        <w:t>C. The online workshop was such useful that many young employees applied its ideas immediately.</w:t>
+      </w:r>
+    </w:p>
+    <w:p>
+      <w:r>
+        <w:t>D. It was such a useful online workshop that many young employees had applied its ideas immediately.</w:t>
+      </w:r>
+    </w:p>
+    <w:p>
+      <w:r>
+        <w:rPr>
+          <w:b/>
+        </w:rPr>
+        <w:t>Sentence combination: Choose A, B, C or D that has the CLOSEST meaning to the given pair of sentences in each question.</w:t>
+      </w:r>
+    </w:p>
+    <w:p>
+      <w:r>
+        <w:rPr>
+          <w:b/>
+        </w:rPr>
+        <w:t xml:space="preserve">Question 38: </w:t>
+      </w:r>
+      <w:r>
+        <w:t>The students had finished planting trees. Then they cleaned the school yard.</w:t>
+      </w:r>
+    </w:p>
+    <w:p>
+      <w:r>
+        <w:t>A. After the students had finished planting trees, they cleaned the school yard.</w:t>
+      </w:r>
+    </w:p>
+    <w:p>
+      <w:r>
+        <w:t>B. Before the students finished planting trees, they cleaned the school yard.</w:t>
+      </w:r>
+    </w:p>
+    <w:p>
+      <w:r>
+        <w:t>C. While the students were finishing planting trees, they cleaned the school yard.</w:t>
+      </w:r>
+    </w:p>
+    <w:p>
+      <w:r>
+        <w:t>D. As soon as the students cleaned the school yard, they finished planting trees.</w:t>
+      </w:r>
+    </w:p>
+    <w:p>
+      <w:r>
+        <w:rPr>
+          <w:b/>
+        </w:rPr>
+        <w:t>Sentence rewriting: Choose A, B, C or D that has the CLOSEST meaning to the given sentence in each question.</w:t>
       </w:r>
     </w:p>
     <w:p>
@@ -1653,27 +1545,35 @@
         <w:t xml:space="preserve">Question 39: </w:t>
       </w:r>
       <w:r>
-        <w:t>Which of the following is NOT true according to the passage?</w:t>
+        <w:t>The scientist presented a report that explained how air pollution affects children's health.</w:t>
       </w:r>
     </w:p>
     <w:p>
       <w:r>
-        <w:t>A. People should follow official instructions during a disaster.</w:t>
+        <w:t>A. The scientist presented a report explaining how air pollution affects children's health.</w:t>
       </w:r>
     </w:p>
     <w:p>
       <w:r>
-        <w:t>B. In a flood, people should move to higher ground.</w:t>
+        <w:t>B. The scientist presented a report explained how air pollution affects children's health.</w:t>
       </w:r>
     </w:p>
     <w:p>
       <w:r>
-        <w:t>C. After a disaster, all buildings are safe to enter again.</w:t>
+        <w:t>C. The scientist presented a report which explaining how air pollution affected children's health.</w:t>
       </w:r>
     </w:p>
     <w:p>
       <w:r>
-        <w:t>D. Communities often help each other after disasters.</w:t>
+        <w:t>D. The scientist presented a report whose explanation was about air pollution affecting children's health.</w:t>
+      </w:r>
+    </w:p>
+    <w:p>
+      <w:r>
+        <w:rPr>
+          <w:b/>
+        </w:rPr>
+        <w:t>Sentence combination: Choose A, B, C or D that has the CLOSEST meaning to the given pair of sentences in each question.</w:t>
       </w:r>
     </w:p>
     <w:p>
@@ -1684,27 +1584,27 @@
         <w:t xml:space="preserve">Question 40: </w:t>
       </w:r>
       <w:r>
-        <w:t>What is the main idea of the passage?</w:t>
+        <w:t>Many young people want to work abroad. They also hope to gain international experience.</w:t>
       </w:r>
     </w:p>
     <w:p>
       <w:r>
-        <w:t>A. Natural disasters only affect large cities.</w:t>
+        <w:t>A. Many young people want to work abroad because they hope to gain international experience.</w:t>
       </w:r>
     </w:p>
     <w:p>
       <w:r>
-        <w:t>B. People should ignore warnings during disasters.</w:t>
+        <w:t>B. Many young people want to work abroad, but they hope to gain international experience.</w:t>
       </w:r>
     </w:p>
     <w:p>
       <w:r>
-        <w:t>C. Natural disasters are interesting events for communities.</w:t>
+        <w:t>C. Many young people want to work abroad although they hope to gain international experience.</w:t>
       </w:r>
     </w:p>
     <w:p>
       <w:r>
-        <w:t>D. People can reduce danger by preparing for and responding properly to natural disasters.</w:t>
+        <w:t>D. Many young people want to work abroad unless they hope to gain international experience.</w:t>
       </w:r>
     </w:p>
     <w:sectPr>

</xml_diff>